<commit_message>
updated capstone documenation - latest version
</commit_message>
<xml_diff>
--- a/BA 3.2 Capstone Project Documentation.docx
+++ b/BA 3.2 Capstone Project Documentation.docx
@@ -2526,7 +2526,17 @@
                 <w:sz w:val="24"/>
                 <w:szCs w:val="24"/>
               </w:rPr>
-              <w:t>224929498</w:t>
+              <w:t>22492949</w:t>
+            </w:r>
+            <w:r>
+              <w:rPr>
+                <w:rFonts w:ascii="Arial" w:hAnsi="Arial" w:cs="Arial"/>
+                <w:b w:val="0"/>
+                <w:bCs w:val="0"/>
+                <w:sz w:val="24"/>
+                <w:szCs w:val="24"/>
+              </w:rPr>
+              <w:t>6</w:t>
             </w:r>
           </w:p>
         </w:tc>
@@ -2844,7 +2854,17 @@
                 <w:sz w:val="24"/>
                 <w:szCs w:val="24"/>
               </w:rPr>
-              <w:t>675</w:t>
+              <w:t>6</w:t>
+            </w:r>
+            <w:r>
+              <w:rPr>
+                <w:rFonts w:ascii="Arial" w:hAnsi="Arial" w:cs="Arial"/>
+                <w:b w:val="0"/>
+                <w:bCs w:val="0"/>
+                <w:sz w:val="24"/>
+                <w:szCs w:val="24"/>
+              </w:rPr>
+              <w:t>95</w:t>
             </w:r>
           </w:p>
         </w:tc>
@@ -2975,6 +2995,82 @@
           </w:p>
         </w:tc>
       </w:tr>
+      <w:tr>
+        <w:tc>
+          <w:tcPr>
+            <w:cnfStyle w:val="001000000000" w:firstRow="0" w:lastRow="0" w:firstColumn="1" w:lastColumn="0" w:oddVBand="0" w:evenVBand="0" w:oddHBand="0" w:evenHBand="0" w:firstRowFirstColumn="0" w:firstRowLastColumn="0" w:lastRowFirstColumn="0" w:lastRowLastColumn="0"/>
+            <w:tcW w:w="3450" w:type="dxa"/>
+          </w:tcPr>
+          <w:p>
+            <w:pPr>
+              <w:rPr>
+                <w:rFonts w:ascii="Arial" w:hAnsi="Arial" w:cs="Arial"/>
+                <w:b w:val="0"/>
+                <w:bCs w:val="0"/>
+                <w:sz w:val="24"/>
+                <w:szCs w:val="24"/>
+              </w:rPr>
+            </w:pPr>
+            <w:r>
+              <w:rPr>
+                <w:rFonts w:ascii="Arial" w:hAnsi="Arial" w:cs="Arial"/>
+                <w:b w:val="0"/>
+                <w:bCs w:val="0"/>
+                <w:sz w:val="24"/>
+                <w:szCs w:val="24"/>
+              </w:rPr>
+              <w:t>224766570</w:t>
+            </w:r>
+          </w:p>
+        </w:tc>
+        <w:tc>
+          <w:tcPr>
+            <w:tcW w:w="3451" w:type="dxa"/>
+          </w:tcPr>
+          <w:p>
+            <w:pPr>
+              <w:ind w:left="720" w:hanging="720"/>
+              <w:cnfStyle w:val="000000000000" w:firstRow="0" w:lastRow="0" w:firstColumn="0" w:lastColumn="0" w:oddVBand="0" w:evenVBand="0" w:oddHBand="0" w:evenHBand="0" w:firstRowFirstColumn="0" w:firstRowLastColumn="0" w:lastRowFirstColumn="0" w:lastRowLastColumn="0"/>
+              <w:rPr>
+                <w:rFonts w:ascii="Arial" w:hAnsi="Arial" w:cs="Arial"/>
+                <w:sz w:val="24"/>
+                <w:szCs w:val="24"/>
+              </w:rPr>
+            </w:pPr>
+            <w:r>
+              <w:rPr>
+                <w:rFonts w:ascii="Arial" w:hAnsi="Arial" w:cs="Arial"/>
+                <w:sz w:val="24"/>
+                <w:szCs w:val="24"/>
+              </w:rPr>
+              <w:t>Thabo Khumalo</w:t>
+            </w:r>
+          </w:p>
+        </w:tc>
+        <w:tc>
+          <w:tcPr>
+            <w:tcW w:w="3451" w:type="dxa"/>
+          </w:tcPr>
+          <w:p>
+            <w:pPr>
+              <w:cnfStyle w:val="000000000000" w:firstRow="0" w:lastRow="0" w:firstColumn="0" w:lastColumn="0" w:oddVBand="0" w:evenVBand="0" w:oddHBand="0" w:evenHBand="0" w:firstRowFirstColumn="0" w:firstRowLastColumn="0" w:lastRowFirstColumn="0" w:lastRowLastColumn="0"/>
+              <w:rPr>
+                <w:rFonts w:ascii="Arial" w:hAnsi="Arial" w:cs="Arial"/>
+                <w:sz w:val="24"/>
+                <w:szCs w:val="24"/>
+              </w:rPr>
+            </w:pPr>
+            <w:r>
+              <w:rPr>
+                <w:rFonts w:ascii="Arial" w:hAnsi="Arial" w:cs="Arial"/>
+                <w:sz w:val="24"/>
+                <w:szCs w:val="24"/>
+              </w:rPr>
+              <w:t>T.A.K</w:t>
+            </w:r>
+          </w:p>
+        </w:tc>
+      </w:tr>
     </w:tbl>
     <w:p>
       <w:pPr>
@@ -3260,6 +3356,12 @@
     <w:bookmarkStart w:id="0" w:name="_Toc240457822" w:displacedByCustomXml="next"/>
     <w:sdt>
       <w:sdtPr>
+        <w:rPr>
+          <w:rFonts w:ascii="Calibri" w:eastAsia="Calibri" w:hAnsi="Calibri" w:cs="Calibri"/>
+          <w:color w:val="auto"/>
+          <w:sz w:val="22"/>
+          <w:szCs w:val="22"/>
+        </w:rPr>
         <w:id w:val="-360597242"/>
         <w:docPartObj>
           <w:docPartGallery w:val="Table of Contents"/>
@@ -3268,13 +3370,9 @@
       </w:sdtPr>
       <w:sdtEndPr>
         <w:rPr>
-          <w:rFonts w:ascii="Calibri" w:eastAsia="Calibri" w:hAnsi="Calibri" w:cs="Calibri"/>
           <w:b/>
           <w:bCs/>
           <w:noProof/>
-          <w:color w:val="auto"/>
-          <w:sz w:val="22"/>
-          <w:szCs w:val="22"/>
         </w:rPr>
       </w:sdtEndPr>
       <w:sdtContent>

</xml_diff>